<commit_message>
Docs: se agrega planteamiento del problema
</commit_message>
<xml_diff>
--- a/Plantilla_Base_Informe_APA.docx
+++ b/Plantilla_Base_Informe_APA.docx
@@ -605,8 +605,14 @@
       <w:pPr>
         <w:pStyle w:val="Ttulo2"/>
         <w:spacing w:before="0" w:line="240" w:lineRule="auto"/>
-      </w:pPr>
-      <w:r>
+        <w:rPr>
+          <w:rFonts w:ascii="Time new roma" w:hAnsi="Time new roma"/>
+        </w:rPr>
+      </w:pPr>
+      <w:r>
+        <w:rPr>
+          <w:rFonts w:ascii="Time new roma" w:hAnsi="Time new roma"/>
+        </w:rPr>
         <w:lastRenderedPageBreak/>
         <w:t>Introducción</w:t>
       </w:r>
@@ -622,33 +628,40 @@
         </w:pBdr>
         <w:spacing w:line="240" w:lineRule="auto"/>
         <w:ind w:firstLine="719"/>
-      </w:pPr>
-    </w:p>
-    <w:p>
-      <w:pPr>
-        <w:pBdr>
-          <w:top w:val="nil"/>
-          <w:left w:val="nil"/>
-          <w:bottom w:val="nil"/>
-          <w:right w:val="nil"/>
-          <w:between w:val="nil"/>
-        </w:pBdr>
-        <w:spacing w:line="240" w:lineRule="auto"/>
-        <w:ind w:firstLine="719"/>
-      </w:pPr>
-    </w:p>
-    <w:p>
-      <w:pPr>
-        <w:pBdr>
-          <w:top w:val="nil"/>
-          <w:left w:val="nil"/>
-          <w:bottom w:val="nil"/>
-          <w:right w:val="nil"/>
-          <w:between w:val="nil"/>
-        </w:pBdr>
-        <w:spacing w:line="240" w:lineRule="auto"/>
-        <w:ind w:firstLine="719"/>
-        <w:rPr>
+        <w:rPr>
+          <w:rFonts w:ascii="Time new roma" w:hAnsi="Time new roma"/>
+        </w:rPr>
+      </w:pPr>
+    </w:p>
+    <w:p>
+      <w:pPr>
+        <w:pBdr>
+          <w:top w:val="nil"/>
+          <w:left w:val="nil"/>
+          <w:bottom w:val="nil"/>
+          <w:right w:val="nil"/>
+          <w:between w:val="nil"/>
+        </w:pBdr>
+        <w:spacing w:line="240" w:lineRule="auto"/>
+        <w:ind w:firstLine="719"/>
+        <w:rPr>
+          <w:rFonts w:ascii="Time new roma" w:hAnsi="Time new roma"/>
+        </w:rPr>
+      </w:pPr>
+    </w:p>
+    <w:p>
+      <w:pPr>
+        <w:pBdr>
+          <w:top w:val="nil"/>
+          <w:left w:val="nil"/>
+          <w:bottom w:val="nil"/>
+          <w:right w:val="nil"/>
+          <w:between w:val="nil"/>
+        </w:pBdr>
+        <w:spacing w:line="240" w:lineRule="auto"/>
+        <w:ind w:firstLine="719"/>
+        <w:rPr>
+          <w:rFonts w:ascii="Time new roma" w:hAnsi="Time new roma"/>
           <w:b/>
           <w:bCs/>
         </w:rPr>
@@ -665,18 +678,28 @@
         </w:pBdr>
         <w:spacing w:line="240" w:lineRule="auto"/>
         <w:ind w:firstLine="719"/>
-      </w:pPr>
-      <w:r>
+        <w:rPr>
+          <w:rFonts w:ascii="Time new roma" w:hAnsi="Time new roma"/>
+        </w:rPr>
+      </w:pPr>
+      <w:r>
+        <w:rPr>
+          <w:rFonts w:ascii="Time new roma" w:hAnsi="Time new roma"/>
+        </w:rPr>
         <w:t xml:space="preserve">Este documento presenta el informe de requisitos para el desarrollo de </w:t>
       </w:r>
       <w:r>
         <w:rPr>
+          <w:rFonts w:ascii="Time new roma" w:hAnsi="Time new roma"/>
           <w:b/>
           <w:bCs/>
         </w:rPr>
         <w:t>“Despensa Virtual y Sugerencias”</w:t>
       </w:r>
       <w:r>
+        <w:rPr>
+          <w:rFonts w:ascii="Time new roma" w:hAnsi="Time new roma"/>
+        </w:rPr>
         <w:t>, una funcionalidad orientada a facilitar la planificación de comidas a partir de los ingredientes que el usuario tiene disponibles en casa. El propósito de este texto es servir como una guía principal para todas las personas involucradas en el proyecto, asegurando que exista una visión clara, estructurada y unificada sobre las características y funcionalidades que debe cumplir el sistema antes de iniciar las diferentes fases de diseño y programación.</w:t>
       </w:r>
     </w:p>
@@ -691,8 +714,14 @@
         </w:pBdr>
         <w:spacing w:line="240" w:lineRule="auto"/>
         <w:ind w:firstLine="719"/>
-      </w:pPr>
-      <w:r>
+        <w:rPr>
+          <w:rFonts w:ascii="Time new roma" w:hAnsi="Time new roma"/>
+        </w:rPr>
+      </w:pPr>
+      <w:r>
+        <w:rPr>
+          <w:rFonts w:ascii="Time new roma" w:hAnsi="Time new roma"/>
+        </w:rPr>
         <w:t>A lo largo de este informe se presentan las necesidades y funcionalidades relacionadas con la gestión de una despensa virtual, permitiendo al usuario registrar y eliminar los productos que tiene disponibles en casa. A partir de esta información, el sistema podrá establecer coincidencias entre los ingredientes disponibles y las recetas, con el objetivo de sugerir qué puede cocinar el usuario y señalar aquellas preparaciones en las que le falta uno o pocos ingredientes. También se contemplan las equivalencias y sustituciones entre diferentes ingredientes, permitiendo ampliar las posibilidades de preparación de las recetas.</w:t>
       </w:r>
     </w:p>
@@ -707,18 +736,28 @@
         </w:pBdr>
         <w:spacing w:line="240" w:lineRule="auto"/>
         <w:ind w:firstLine="719"/>
-      </w:pPr>
-      <w:r>
+        <w:rPr>
+          <w:rFonts w:ascii="Time new roma" w:hAnsi="Time new roma"/>
+        </w:rPr>
+      </w:pPr>
+      <w:r>
+        <w:rPr>
+          <w:rFonts w:ascii="Time new roma" w:hAnsi="Time new roma"/>
+        </w:rPr>
         <w:t xml:space="preserve">Para hacer que la información técnica y funcional sea mucho más fácil de entender, el contenido de este documento se apoya en diferentes recursos que permiten visualizar cómo interactuará el usuario con el sistema. Se incluyen elementos que ayudan a comprender el funcionamiento de la despensa y las sugerencias, así como tablas detalladas que organizan los requisitos y permiten identificar de manera precisa qué debe hacer la aplicación y cómo debe comportarse. Además, se contempla el cálculo del </w:t>
       </w:r>
       <w:r>
         <w:rPr>
+          <w:rFonts w:ascii="Time new roma" w:hAnsi="Time new roma"/>
           <w:b/>
           <w:bCs/>
         </w:rPr>
         <w:t>porcentaje de coincidencia entre los ingredientes disponibles y cada receta</w:t>
       </w:r>
       <w:r>
+        <w:rPr>
+          <w:rFonts w:ascii="Time new roma" w:hAnsi="Time new roma"/>
+        </w:rPr>
         <w:t>, junto con el registro del historial de búsquedas realizadas.</w:t>
       </w:r>
     </w:p>
@@ -733,28 +772,42 @@
         </w:pBdr>
         <w:spacing w:line="240" w:lineRule="auto"/>
         <w:ind w:firstLine="719"/>
-      </w:pPr>
-      <w:r>
+        <w:rPr>
+          <w:rFonts w:ascii="Time new roma" w:hAnsi="Time new roma"/>
+        </w:rPr>
+      </w:pPr>
+      <w:r>
+        <w:rPr>
+          <w:rFonts w:ascii="Time new roma" w:hAnsi="Time new roma"/>
+        </w:rPr>
         <w:t xml:space="preserve">Por último, se incluye un glosario de términos pensado para facilitar la comprensión del vocabulario técnico utilizado durante el desarrollo, especialmente aquellos conceptos relacionados con la despensa virtual, las recetas, las coincidencias, las equivalencias y las sustituciones. En resumen, en las siguientes páginas se encuentra la base funcional y técnica necesaria para orientar el desarrollo de </w:t>
       </w:r>
       <w:r>
         <w:rPr>
+          <w:rFonts w:ascii="Time new roma" w:hAnsi="Time new roma"/>
           <w:b/>
           <w:bCs/>
         </w:rPr>
         <w:t>“Despensa Virtual y Sugerencias”</w:t>
       </w:r>
       <w:r>
+        <w:rPr>
+          <w:rFonts w:ascii="Time new roma" w:hAnsi="Time new roma"/>
+        </w:rPr>
         <w:t xml:space="preserve"> de manera organizada, teniendo como propósito cumplir la promesa de que </w:t>
       </w:r>
       <w:r>
         <w:rPr>
+          <w:rFonts w:ascii="Time new roma" w:hAnsi="Time new roma"/>
           <w:b/>
           <w:bCs/>
         </w:rPr>
         <w:t>el usuario registre lo que tiene en casa y el sistema le sugiera qué puede cocinar hoy y qué le falta por poco</w:t>
       </w:r>
       <w:r>
+        <w:rPr>
+          <w:rFonts w:ascii="Time new roma" w:hAnsi="Time new roma"/>
+        </w:rPr>
         <w:t>.</w:t>
       </w:r>
     </w:p>
@@ -769,6 +822,446 @@
         </w:pBdr>
         <w:spacing w:line="240" w:lineRule="auto"/>
         <w:ind w:firstLine="719"/>
+        <w:rPr>
+          <w:rFonts w:ascii="Time new roma" w:hAnsi="Time new roma"/>
+        </w:rPr>
+      </w:pPr>
+    </w:p>
+    <w:p>
+      <w:pPr>
+        <w:pBdr>
+          <w:top w:val="nil"/>
+          <w:left w:val="nil"/>
+          <w:bottom w:val="nil"/>
+          <w:right w:val="nil"/>
+          <w:between w:val="nil"/>
+        </w:pBdr>
+        <w:spacing w:line="240" w:lineRule="auto"/>
+        <w:ind w:firstLine="719"/>
+        <w:rPr>
+          <w:rFonts w:ascii="Time new roma" w:hAnsi="Time new roma"/>
+        </w:rPr>
+      </w:pPr>
+    </w:p>
+    <w:p>
+      <w:pPr>
+        <w:pBdr>
+          <w:top w:val="nil"/>
+          <w:left w:val="nil"/>
+          <w:bottom w:val="nil"/>
+          <w:right w:val="nil"/>
+          <w:between w:val="nil"/>
+        </w:pBdr>
+        <w:spacing w:line="240" w:lineRule="auto"/>
+        <w:ind w:firstLine="719"/>
+        <w:rPr>
+          <w:rFonts w:ascii="Time new roma" w:hAnsi="Time new roma"/>
+        </w:rPr>
+      </w:pPr>
+    </w:p>
+    <w:p>
+      <w:pPr>
+        <w:pBdr>
+          <w:top w:val="nil"/>
+          <w:left w:val="nil"/>
+          <w:bottom w:val="nil"/>
+          <w:right w:val="nil"/>
+          <w:between w:val="nil"/>
+        </w:pBdr>
+        <w:spacing w:line="240" w:lineRule="auto"/>
+        <w:ind w:firstLine="719"/>
+        <w:rPr>
+          <w:rFonts w:ascii="Time new roma" w:hAnsi="Time new roma"/>
+        </w:rPr>
+      </w:pPr>
+    </w:p>
+    <w:p>
+      <w:pPr>
+        <w:pBdr>
+          <w:top w:val="nil"/>
+          <w:left w:val="nil"/>
+          <w:bottom w:val="nil"/>
+          <w:right w:val="nil"/>
+          <w:between w:val="nil"/>
+        </w:pBdr>
+        <w:spacing w:line="240" w:lineRule="auto"/>
+        <w:ind w:firstLine="719"/>
+        <w:rPr>
+          <w:rFonts w:ascii="Time new roma" w:hAnsi="Time new roma"/>
+        </w:rPr>
+      </w:pPr>
+    </w:p>
+    <w:p>
+      <w:pPr>
+        <w:pBdr>
+          <w:top w:val="nil"/>
+          <w:left w:val="nil"/>
+          <w:bottom w:val="nil"/>
+          <w:right w:val="nil"/>
+          <w:between w:val="nil"/>
+        </w:pBdr>
+        <w:spacing w:line="240" w:lineRule="auto"/>
+        <w:ind w:firstLine="719"/>
+        <w:rPr>
+          <w:rFonts w:ascii="Time new roma" w:hAnsi="Time new roma"/>
+        </w:rPr>
+      </w:pPr>
+    </w:p>
+    <w:p>
+      <w:pPr>
+        <w:pBdr>
+          <w:top w:val="nil"/>
+          <w:left w:val="nil"/>
+          <w:bottom w:val="nil"/>
+          <w:right w:val="nil"/>
+          <w:between w:val="nil"/>
+        </w:pBdr>
+        <w:spacing w:line="240" w:lineRule="auto"/>
+        <w:ind w:firstLine="719"/>
+        <w:rPr>
+          <w:rFonts w:ascii="Time new roma" w:hAnsi="Time new roma"/>
+        </w:rPr>
+      </w:pPr>
+    </w:p>
+    <w:p>
+      <w:pPr>
+        <w:pBdr>
+          <w:top w:val="nil"/>
+          <w:left w:val="nil"/>
+          <w:bottom w:val="nil"/>
+          <w:right w:val="nil"/>
+          <w:between w:val="nil"/>
+        </w:pBdr>
+        <w:spacing w:line="240" w:lineRule="auto"/>
+        <w:ind w:firstLine="719"/>
+        <w:rPr>
+          <w:rFonts w:ascii="Time new roma" w:hAnsi="Time new roma"/>
+        </w:rPr>
+      </w:pPr>
+    </w:p>
+    <w:p>
+      <w:pPr>
+        <w:pBdr>
+          <w:top w:val="nil"/>
+          <w:left w:val="nil"/>
+          <w:bottom w:val="nil"/>
+          <w:right w:val="nil"/>
+          <w:between w:val="nil"/>
+        </w:pBdr>
+        <w:spacing w:line="240" w:lineRule="auto"/>
+        <w:ind w:firstLine="719"/>
+        <w:rPr>
+          <w:rFonts w:ascii="Time new roma" w:hAnsi="Time new roma"/>
+        </w:rPr>
+      </w:pPr>
+    </w:p>
+    <w:p>
+      <w:pPr>
+        <w:pBdr>
+          <w:top w:val="nil"/>
+          <w:left w:val="nil"/>
+          <w:bottom w:val="nil"/>
+          <w:right w:val="nil"/>
+          <w:between w:val="nil"/>
+        </w:pBdr>
+        <w:spacing w:line="240" w:lineRule="auto"/>
+        <w:ind w:firstLine="719"/>
+        <w:rPr>
+          <w:rFonts w:ascii="Time new roma" w:hAnsi="Time new roma"/>
+        </w:rPr>
+      </w:pPr>
+    </w:p>
+    <w:p>
+      <w:pPr>
+        <w:pBdr>
+          <w:top w:val="nil"/>
+          <w:left w:val="nil"/>
+          <w:bottom w:val="nil"/>
+          <w:right w:val="nil"/>
+          <w:between w:val="nil"/>
+        </w:pBdr>
+        <w:spacing w:line="240" w:lineRule="auto"/>
+        <w:ind w:firstLine="719"/>
+        <w:rPr>
+          <w:rFonts w:ascii="Time new roma" w:hAnsi="Time new roma"/>
+        </w:rPr>
+      </w:pPr>
+    </w:p>
+    <w:p>
+      <w:pPr>
+        <w:pBdr>
+          <w:top w:val="nil"/>
+          <w:left w:val="nil"/>
+          <w:bottom w:val="nil"/>
+          <w:right w:val="nil"/>
+          <w:between w:val="nil"/>
+        </w:pBdr>
+        <w:spacing w:line="240" w:lineRule="auto"/>
+        <w:rPr>
+          <w:rFonts w:ascii="Time new roma" w:hAnsi="Time new roma"/>
+        </w:rPr>
+      </w:pPr>
+    </w:p>
+    <w:p>
+      <w:pPr>
+        <w:pBdr>
+          <w:top w:val="nil"/>
+          <w:left w:val="nil"/>
+          <w:bottom w:val="nil"/>
+          <w:right w:val="nil"/>
+          <w:between w:val="nil"/>
+        </w:pBdr>
+        <w:spacing w:line="240" w:lineRule="auto"/>
+        <w:rPr>
+          <w:rFonts w:ascii="Time new roma" w:hAnsi="Time new roma"/>
+        </w:rPr>
+      </w:pPr>
+    </w:p>
+    <w:p>
+      <w:pPr>
+        <w:pBdr>
+          <w:top w:val="nil"/>
+          <w:left w:val="nil"/>
+          <w:bottom w:val="nil"/>
+          <w:right w:val="nil"/>
+          <w:between w:val="nil"/>
+        </w:pBdr>
+        <w:spacing w:line="240" w:lineRule="auto"/>
+        <w:jc w:val="center"/>
+        <w:rPr>
+          <w:rFonts w:ascii="Time new roma" w:hAnsi="Time new roma"/>
+          <w:b/>
+          <w:bCs/>
+          <w:sz w:val="36"/>
+          <w:szCs w:val="36"/>
+        </w:rPr>
+      </w:pPr>
+      <w:r>
+        <w:rPr>
+          <w:rFonts w:ascii="Time new roma" w:hAnsi="Time new roma"/>
+          <w:b/>
+          <w:bCs/>
+          <w:sz w:val="36"/>
+          <w:szCs w:val="36"/>
+        </w:rPr>
+        <w:t>Planteamiento</w:t>
+      </w:r>
+    </w:p>
+    <w:p>
+      <w:pPr>
+        <w:pBdr>
+          <w:top w:val="nil"/>
+          <w:left w:val="nil"/>
+          <w:bottom w:val="nil"/>
+          <w:right w:val="nil"/>
+          <w:between w:val="nil"/>
+        </w:pBdr>
+        <w:spacing w:line="240" w:lineRule="auto"/>
+        <w:jc w:val="center"/>
+        <w:rPr>
+          <w:rFonts w:ascii="Time new roma" w:hAnsi="Time new roma"/>
+          <w:sz w:val="36"/>
+          <w:szCs w:val="36"/>
+        </w:rPr>
+      </w:pPr>
+    </w:p>
+    <w:p>
+      <w:pPr>
+        <w:pBdr>
+          <w:top w:val="nil"/>
+          <w:left w:val="nil"/>
+          <w:bottom w:val="nil"/>
+          <w:right w:val="nil"/>
+          <w:between w:val="nil"/>
+        </w:pBdr>
+        <w:spacing w:line="240" w:lineRule="auto"/>
+        <w:jc w:val="center"/>
+        <w:rPr>
+          <w:rFonts w:ascii="Time new roma" w:hAnsi="Time new roma"/>
+          <w:sz w:val="36"/>
+          <w:szCs w:val="36"/>
+        </w:rPr>
+      </w:pPr>
+    </w:p>
+    <w:p>
+      <w:pPr>
+        <w:pBdr>
+          <w:top w:val="nil"/>
+          <w:left w:val="nil"/>
+          <w:bottom w:val="nil"/>
+          <w:right w:val="nil"/>
+          <w:between w:val="nil"/>
+        </w:pBdr>
+        <w:spacing w:line="240" w:lineRule="auto"/>
+        <w:jc w:val="center"/>
+        <w:rPr>
+          <w:rFonts w:ascii="Time new roma" w:hAnsi="Time new roma"/>
+          <w:sz w:val="36"/>
+          <w:szCs w:val="36"/>
+        </w:rPr>
+      </w:pPr>
+    </w:p>
+    <w:p>
+      <w:pPr>
+        <w:pBdr>
+          <w:top w:val="nil"/>
+          <w:left w:val="nil"/>
+          <w:bottom w:val="nil"/>
+          <w:right w:val="nil"/>
+          <w:between w:val="nil"/>
+        </w:pBdr>
+        <w:spacing w:line="240" w:lineRule="auto"/>
+        <w:rPr>
+          <w:rFonts w:ascii="Time new roma" w:hAnsi="Time new roma"/>
+        </w:rPr>
+      </w:pPr>
+    </w:p>
+    <w:p>
+      <w:pPr>
+        <w:pBdr>
+          <w:top w:val="nil"/>
+          <w:left w:val="nil"/>
+          <w:bottom w:val="nil"/>
+          <w:right w:val="nil"/>
+          <w:between w:val="nil"/>
+        </w:pBdr>
+        <w:spacing w:line="240" w:lineRule="auto"/>
+        <w:rPr>
+          <w:rFonts w:ascii="Time new roma" w:hAnsi="Time new roma"/>
+        </w:rPr>
+      </w:pPr>
+      <w:r>
+        <w:rPr>
+          <w:rFonts w:ascii="Time new roma" w:hAnsi="Time new roma"/>
+        </w:rPr>
+        <w:t xml:space="preserve">Actualmente, muchas personas gestionan su alimentación diaria sin un control claro de los ingredientes que poseen en sus hogares, lo que puede generar </w:t>
+      </w:r>
+      <w:r>
+        <w:rPr>
+          <w:rFonts w:ascii="Time new roma" w:hAnsi="Time new roma"/>
+          <w:b/>
+          <w:bCs/>
+        </w:rPr>
+        <w:t>compras innecesarias, acumulación de productos, desperdicio de alimentos y dificultad para decidir qué preparar</w:t>
+      </w:r>
+      <w:r>
+        <w:rPr>
+          <w:rFonts w:ascii="Time new roma" w:hAnsi="Time new roma"/>
+        </w:rPr>
+        <w:t>. Además, cuando una receta requiere ingredientes que no están disponibles, muchas veces se desconoce qué productos pueden utilizarse como sustitutos o qué otras recetas podrían prepararse con los alimentos existentes.</w:t>
+      </w:r>
+    </w:p>
+    <w:p>
+      <w:pPr>
+        <w:pBdr>
+          <w:top w:val="nil"/>
+          <w:left w:val="nil"/>
+          <w:bottom w:val="nil"/>
+          <w:right w:val="nil"/>
+          <w:between w:val="nil"/>
+        </w:pBdr>
+        <w:spacing w:line="240" w:lineRule="auto"/>
+        <w:rPr>
+          <w:rFonts w:ascii="Time new roma" w:hAnsi="Time new roma"/>
+        </w:rPr>
+      </w:pPr>
+      <w:r>
+        <w:rPr>
+          <w:rFonts w:ascii="Time new roma" w:hAnsi="Time new roma"/>
+        </w:rPr>
+        <w:t xml:space="preserve">Esta problemática se debe principalmente a la </w:t>
+      </w:r>
+      <w:r>
+        <w:rPr>
+          <w:rFonts w:ascii="Time new roma" w:hAnsi="Time new roma"/>
+          <w:b/>
+          <w:bCs/>
+        </w:rPr>
+        <w:t>falta de una herramienta que permita organizar y visualizar de manera sencilla los productos disponibles en el hogar</w:t>
+      </w:r>
+      <w:r>
+        <w:rPr>
+          <w:rFonts w:ascii="Time new roma" w:hAnsi="Time new roma"/>
+        </w:rPr>
+        <w:t>, relacionándolos con diferentes opciones de recetas. Como consecuencia, los usuarios pueden terminar comprando productos que ya poseen, dejando vencer alimentos o recurriendo constantemente a las mismas preparaciones por no conocer otras alternativas.</w:t>
+      </w:r>
+    </w:p>
+    <w:p>
+      <w:pPr>
+        <w:pBdr>
+          <w:top w:val="nil"/>
+          <w:left w:val="nil"/>
+          <w:bottom w:val="nil"/>
+          <w:right w:val="nil"/>
+          <w:between w:val="nil"/>
+        </w:pBdr>
+        <w:spacing w:line="240" w:lineRule="auto"/>
+        <w:rPr>
+          <w:rFonts w:ascii="Time new roma" w:hAnsi="Time new roma"/>
+        </w:rPr>
+      </w:pPr>
+      <w:r>
+        <w:rPr>
+          <w:rFonts w:ascii="Time new roma" w:hAnsi="Time new roma"/>
+        </w:rPr>
+        <w:t xml:space="preserve">Para dar respuesta a esta problemática, se propone el desarrollo del módulo </w:t>
+      </w:r>
+      <w:r>
+        <w:rPr>
+          <w:rFonts w:ascii="Time new roma" w:hAnsi="Time new roma"/>
+          <w:b/>
+          <w:bCs/>
+        </w:rPr>
+        <w:t>“Despensa Virtual y Sugerencias”</w:t>
+      </w:r>
+      <w:r>
+        <w:rPr>
+          <w:rFonts w:ascii="Time new roma" w:hAnsi="Time new roma"/>
+        </w:rPr>
+        <w:t xml:space="preserve"> para el aplicativo </w:t>
+      </w:r>
+      <w:r>
+        <w:rPr>
+          <w:rFonts w:ascii="Time new roma" w:hAnsi="Time new roma"/>
+          <w:b/>
+          <w:bCs/>
+        </w:rPr>
+        <w:t>Sazón</w:t>
+      </w:r>
+      <w:r>
+        <w:rPr>
+          <w:rFonts w:ascii="Time new roma" w:hAnsi="Time new roma"/>
+        </w:rPr>
+        <w:t xml:space="preserve">, una herramienta que permitirá registrar los productos disponibles en casa y relacionarlos con las recetas del sistema. Mediante un motor de coincidencias, la plataforma podrá sugerir qué cocinar con los ingredientes disponibles, indicar el porcentaje de coincidencia de cada receta y mostrar aquellas preparaciones en las que </w:t>
+      </w:r>
+      <w:r>
+        <w:rPr>
+          <w:rFonts w:ascii="Time new roma" w:hAnsi="Time new roma"/>
+          <w:b/>
+          <w:bCs/>
+        </w:rPr>
+        <w:t>falta uno o pocos ingredientes</w:t>
+      </w:r>
+      <w:r>
+        <w:rPr>
+          <w:rFonts w:ascii="Time new roma" w:hAnsi="Time new roma"/>
+        </w:rPr>
+        <w:t>, teniendo en cuenta también equivalencias y posibles sustituciones. De esta manera, se busca reducir la incertidumbre al momento de decidir qué cocinar y promover un mejor aprovechamiento de los alimentos disponibles.</w:t>
+      </w:r>
+    </w:p>
+    <w:p>
+      <w:pPr>
+        <w:pBdr>
+          <w:top w:val="nil"/>
+          <w:left w:val="nil"/>
+          <w:bottom w:val="nil"/>
+          <w:right w:val="nil"/>
+          <w:between w:val="nil"/>
+        </w:pBdr>
+        <w:spacing w:line="240" w:lineRule="auto"/>
+        <w:rPr>
+          <w:rFonts w:ascii="Time new roma" w:hAnsi="Time new roma"/>
+        </w:rPr>
       </w:pPr>
     </w:p>
     <w:sectPr>

</xml_diff>